<commit_message>
Add completed Vivado smart parking project
</commit_message>
<xml_diff>
--- a/resume/Fahed_Jiha_Computer_Engineering_Resume.docx
+++ b/resume/Fahed_Jiha_Computer_Engineering_Resume.docx
@@ -102,7 +102,7 @@
           <w:color w:val="202830"/>
           <w:sz w:val="17"/>
         </w:rPr>
-        <w:t>Computer Engineering student and IT / Systems Engineer with hands-on experience in business technology support, embedded systems, FPGA/SoC coursework, Python and C++ development, electronics repair, and consultative sales. Builds practical automation and IoT solutions and is known for methodical troubleshooting, clear communication, and translating technical requirements into reliable results.</w:t>
+        <w:t>Computer Engineering student and IT / Systems Engineer with hands-on experience in business technology support, embedded systems, FPGA design and SoC coursework, Python and C++ development, electronics repair, and consultative sales. Builds practical automation and IoT solutions and is known for methodical troubleshooting, clear communication, and translating technical requirements into reliable results.</w:t>
       </w:r>
     </w:p>
     <w:p>
@@ -500,7 +500,9 @@
           <w:color w:val="202830"/>
           <w:sz w:val="18"/>
         </w:rPr>
-        <w:t>Embedded Systems &amp; Zybo Z7 Coursework</w:t>
+        <w:t>FPGA Smart Parking &amp; Embedded Systems</w:t>
+        <w:tab/>
+        <w:t>2025-2026</w:t>
       </w:r>
       <w:r>
         <w:rPr>
@@ -509,8 +511,6 @@
           <w:color w:val="54606A"/>
           <w:sz w:val="18"/>
         </w:rPr>
-        <w:tab/>
-        <w:t>2025-2026</w:t>
       </w:r>
     </w:p>
     <w:p>
@@ -538,7 +538,7 @@
           <w:color w:val="202830"/>
           <w:sz w:val="17"/>
         </w:rPr>
-        <w:t>Designed an FPGA smart-parking system specification using counters, finite-state logic, input debouncing, LEDs, and seven-segment output; completed Zybo/Vivado/Vitis and AXI GPIO coursework.</w:t>
+        <w:t>Built and verified a VHDL smart-parking controller for the Zybo Z7-20 with debounced inputs, bounded counting, a self-checking testbench, timing closure, bitstream generation, and successful FPGA programming.</w:t>
       </w:r>
     </w:p>
     <w:p>

</xml_diff>